<commit_message>
Pocion mediana my friend, y solito
</commit_message>
<xml_diff>
--- a/Codigo principal/Cronograma2/Cronograma Mejorado (v2.3 - POO Profunda con Flexibilidad).docx
+++ b/Codigo principal/Cronograma2/Cronograma Mejorado (v2.3 - POO Profunda con Flexibilidad).docx
@@ -4,7 +4,7 @@
   <w:body>
     <w:p>
       <w:pPr>
-        <w:pStyle w:val="Heading1"/>
+        <w:pStyle w:val="Normal"/>
         <w:numPr>
           <w:ilvl w:val="0"/>
           <w:numId w:val="0"/>
@@ -14,94 +14,565 @@
         <w:ind w:hanging="0" w:start="0"/>
         <w:jc w:val="start"/>
         <w:rPr>
+          <w:rFonts w:ascii="sans-serif" w:hAnsi="sans-serif"/>
           <w:b w:val="false"/>
           <w:bCs w:val="false"/>
           <w:i w:val="false"/>
           <w:iCs w:val="false"/>
+          <w:color w:val="000000"/>
           <w:sz w:val="24"/>
           <w:szCs w:val="24"/>
-        </w:rPr>
-      </w:pPr>
-      <w:r>
-        <w:rPr>
+          <w:shd w:fill="auto" w:val="clear"/>
+        </w:rPr>
+      </w:pPr>
+      <w:r>
+        <w:rPr>
+          <w:rFonts w:ascii="sans-serif" w:hAnsi="sans-serif"/>
           <w:b w:val="false"/>
           <w:bCs w:val="false"/>
           <w:i w:val="false"/>
           <w:iCs w:val="false"/>
+          <w:color w:val="000000"/>
           <w:sz w:val="24"/>
           <w:szCs w:val="24"/>
-        </w:rPr>
-        <w:t>CRONOGRAMA DETALLADO</w:t>
-        <w:br/>
-        <w:t>FASE 0: DESMAGIFICACIÓN (Semanas 1-2 o hasta umbral 70%)</w:t>
-        <w:br/>
-        <w:t>Objetivo: Convertir "código mágico" en "código comprendido"</w:t>
-        <w:br/>
-        <w:t>SEMANA 1: Anatomía del Código Actual</w:t>
-        <w:br/>
-        <w:t>· Día 1: Función normalize() con unicodedata</w:t>
-        <w:br/>
-        <w:t>· Actividad: Explicar línea por línea, reimplementar sin copiar</w:t>
-        <w:br/>
-        <w:t>· Meta: Nivel 2 en normalize</w:t>
-        <w:br/>
-        <w:t>· Día 2: Patrón dict.update() en cargar_partida()</w:t>
-        <w:br/>
-        <w:t>· Actividad: Reescribir sin este patrón, luego entender por qué existe</w:t>
-        <w:br/>
-        <w:t>· Meta: Nivel 3 en serialización</w:t>
-        <w:br/>
-        <w:t>· Día 3: Diagrama de clases REAL</w:t>
-        <w:br/>
-        <w:t>· Actividad: Dibujar relaciones actuales con atributos reales (usar browse_page para herramienta de diagramas si necesario)</w:t>
-        <w:br/>
-        <w:t>· Meta: Visualizar acoplamiento</w:t>
-        <w:br/>
-        <w:t>· Día 4: Diccionario CLASES y getattr/setattr</w:t>
-        <w:br/>
-        <w:t>· Actividad: Crear sistema alternativo, luego entender ventajas del actual</w:t>
-        <w:br/>
-        <w:t>· Meta: Nivel 3 en metaprogramación</w:t>
-        <w:br/>
-        <w:t>· Día 5: Evaluación de desmagificación</w:t>
-        <w:br/>
-        <w:t>· Actividad: Quizz de 5 preguntas + code_execution para tests</w:t>
-        <w:br/>
-        <w:t>· Meta: Subir del 40% al 50% de código comprendido</w:t>
-        <w:br/>
-        <w:t>· Ramificación: Si &gt;60%, salta a Semana 2 Día 3SEMANA 2: Refactorización Guiada</w:t>
-        <w:br/>
-        <w:t>· Día 1: Extraer combate() de main.py</w:t>
-        <w:br/>
-        <w:t>· Actividad: Crear sistema_combate.py con responsabilidad única</w:t>
-        <w:br/>
-        <w:t>· Meta: Nivel 3 en acoplamiento</w:t>
-        <w:br/>
-        <w:t>· Día 2: Clase Juego para manejar bucle principal</w:t>
-        <w:br/>
-        <w:t>· Actividad: Refactorizar main.py en clases con responsabilidades claras</w:t>
-        <w:br/>
-        <w:t>· Meta: Nivel 2 en MVC</w:t>
-        <w:br/>
-        <w:t>· Día 3: Implementar init de memoria</w:t>
-        <w:br/>
-        <w:t>· Actividad: Reescribir clases sin copiar, solo con notas</w:t>
-        <w:br/>
-        <w:t>· Meta: Internalizar estructura</w:t>
-        <w:br/>
-        <w:t>· Día 4: Sistema de eventos básico</w:t>
-        <w:br/>
-        <w:t>· Actividad: Crear pub/sub simple para desacoplar acciones (code_execution para test)</w:t>
-        <w:br/>
-        <w:t>· Meta: Nivel 2 en Observer</w:t>
-        <w:br/>
-        <w:t>· Día 5: Checkpoint de comprensión</w:t>
-        <w:br/>
-        <w:t>· Actividad: Quizz de 5 preguntas + auto-evaluación contrastada</w:t>
-        <w:br/>
-        <w:t>· Meta: 60% comprensión</w:t>
-        <w:br/>
-        <w:t>· Ramificación: Si &lt;60%, repetir semana con huecos adaptados a lagunas; si &gt;70%, saltar a Fase 1 Día 3(El resto del cronograma sigue similar, con ramificaciones en cada semana: "Si comprensión &gt;80%, salta a X; si &lt;60%, repetir con enfoque en lagunas + preguntas metacognitivas". Añadir "Usar code_execution para tests prácticos" en activities de implementación.)</w:t>
+          <w:shd w:fill="auto" w:val="clear"/>
+        </w:rPr>
+        <w:t>SEMANA 1: Repaso Herencia y super()</w:t>
+      </w:r>
+    </w:p>
+    <w:p>
+      <w:pPr>
+        <w:pStyle w:val="BodyText"/>
+        <w:numPr>
+          <w:ilvl w:val="0"/>
+          <w:numId w:val="1"/>
+        </w:numPr>
+        <w:tabs>
+          <w:tab w:val="clear" w:pos="709"/>
+          <w:tab w:val="left" w:pos="0" w:leader="none"/>
+        </w:tabs>
+        <w:bidi w:val="0"/>
+        <w:spacing w:before="0" w:after="0"/>
+        <w:ind w:hanging="283" w:start="709" w:end="0"/>
+        <w:rPr>
+          <w:rFonts w:ascii="sans-serif" w:hAnsi="sans-serif"/>
+          <w:color w:val="000000"/>
+          <w:shd w:fill="auto" w:val="clear"/>
+        </w:rPr>
+      </w:pPr>
+      <w:r>
+        <w:rPr>
+          <w:rFonts w:ascii="sans-serif" w:hAnsi="sans-serif"/>
+          <w:color w:val="000000"/>
+          <w:shd w:fill="auto" w:val="clear"/>
+        </w:rPr>
+        <w:t>Día 1-2: Huecos kinestésicos + code_execution</w:t>
+      </w:r>
+    </w:p>
+    <w:p>
+      <w:pPr>
+        <w:pStyle w:val="BodyText"/>
+        <w:numPr>
+          <w:ilvl w:val="0"/>
+          <w:numId w:val="1"/>
+        </w:numPr>
+        <w:tabs>
+          <w:tab w:val="clear" w:pos="709"/>
+          <w:tab w:val="left" w:pos="0" w:leader="none"/>
+        </w:tabs>
+        <w:bidi w:val="0"/>
+        <w:spacing w:before="0" w:after="0"/>
+        <w:ind w:hanging="283" w:start="709" w:end="0"/>
+        <w:rPr>
+          <w:rFonts w:ascii="sans-serif" w:hAnsi="sans-serif"/>
+          <w:color w:val="000000"/>
+          <w:shd w:fill="auto" w:val="clear"/>
+        </w:rPr>
+      </w:pPr>
+      <w:r>
+        <w:rPr>
+          <w:rFonts w:ascii="sans-serif" w:hAnsi="sans-serif"/>
+          <w:color w:val="000000"/>
+          <w:shd w:fill="auto" w:val="clear"/>
+        </w:rPr>
+        <w:t>Día 3: Checkpoint + quiz opcional</w:t>
+      </w:r>
+    </w:p>
+    <w:p>
+      <w:pPr>
+        <w:pStyle w:val="BodyText"/>
+        <w:numPr>
+          <w:ilvl w:val="0"/>
+          <w:numId w:val="1"/>
+        </w:numPr>
+        <w:tabs>
+          <w:tab w:val="clear" w:pos="709"/>
+          <w:tab w:val="left" w:pos="0" w:leader="none"/>
+        </w:tabs>
+        <w:bidi w:val="0"/>
+        <w:spacing w:before="0" w:after="0"/>
+        <w:ind w:hanging="283" w:start="709" w:end="0"/>
+        <w:rPr>
+          <w:rFonts w:ascii="sans-serif" w:hAnsi="sans-serif"/>
+          <w:color w:val="000000"/>
+          <w:shd w:fill="auto" w:val="clear"/>
+        </w:rPr>
+      </w:pPr>
+      <w:r>
+        <w:rPr>
+          <w:rFonts w:ascii="sans-serif" w:hAnsi="sans-serif"/>
+          <w:color w:val="000000"/>
+          <w:shd w:fill="auto" w:val="clear"/>
+        </w:rPr>
+        <w:t>Ramificación: &gt;80% → salta Semana 2</w:t>
+      </w:r>
+    </w:p>
+    <w:p>
+      <w:pPr>
+        <w:pStyle w:val="BodyText"/>
+        <w:spacing w:before="200" w:after="120"/>
+        <w:ind w:hanging="0" w:start="0" w:end="0"/>
+        <w:rPr>
+          <w:rFonts w:ascii="sans-serif" w:hAnsi="sans-serif"/>
+          <w:color w:val="000000"/>
+          <w:shd w:fill="auto" w:val="clear"/>
+        </w:rPr>
+      </w:pPr>
+      <w:r>
+        <w:rPr>
+          <w:rFonts w:ascii="sans-serif" w:hAnsi="sans-serif"/>
+          <w:color w:val="000000"/>
+          <w:shd w:fill="auto" w:val="clear"/>
+        </w:rPr>
+        <w:t>SEMANA 2: Polimorfismo</w:t>
+      </w:r>
+    </w:p>
+    <w:p>
+      <w:pPr>
+        <w:pStyle w:val="BodyText"/>
+        <w:numPr>
+          <w:ilvl w:val="0"/>
+          <w:numId w:val="2"/>
+        </w:numPr>
+        <w:tabs>
+          <w:tab w:val="clear" w:pos="709"/>
+          <w:tab w:val="left" w:pos="0" w:leader="none"/>
+        </w:tabs>
+        <w:bidi w:val="0"/>
+        <w:spacing w:before="0" w:after="0"/>
+        <w:ind w:hanging="283" w:start="709" w:end="0"/>
+        <w:rPr>
+          <w:rFonts w:ascii="sans-serif" w:hAnsi="sans-serif"/>
+          <w:color w:val="000000"/>
+          <w:shd w:fill="auto" w:val="clear"/>
+        </w:rPr>
+      </w:pPr>
+      <w:r>
+        <w:rPr>
+          <w:rFonts w:ascii="sans-serif" w:hAnsi="sans-serif"/>
+          <w:color w:val="000000"/>
+          <w:shd w:fill="auto" w:val="clear"/>
+        </w:rPr>
+        <w:t>Día 1-3: Override, duck typing, ejercicios con huecos</w:t>
+      </w:r>
+    </w:p>
+    <w:p>
+      <w:pPr>
+        <w:pStyle w:val="BodyText"/>
+        <w:numPr>
+          <w:ilvl w:val="0"/>
+          <w:numId w:val="2"/>
+        </w:numPr>
+        <w:tabs>
+          <w:tab w:val="clear" w:pos="709"/>
+          <w:tab w:val="left" w:pos="0" w:leader="none"/>
+        </w:tabs>
+        <w:bidi w:val="0"/>
+        <w:spacing w:before="0" w:after="0"/>
+        <w:ind w:hanging="283" w:start="709" w:end="0"/>
+        <w:rPr>
+          <w:rFonts w:ascii="sans-serif" w:hAnsi="sans-serif"/>
+          <w:color w:val="000000"/>
+          <w:shd w:fill="auto" w:val="clear"/>
+        </w:rPr>
+      </w:pPr>
+      <w:r>
+        <w:rPr>
+          <w:rFonts w:ascii="sans-serif" w:hAnsi="sans-serif"/>
+          <w:color w:val="000000"/>
+          <w:shd w:fill="auto" w:val="clear"/>
+        </w:rPr>
+        <w:t>Día 4: Aplicación a Guerrero/Jefe</w:t>
+      </w:r>
+    </w:p>
+    <w:p>
+      <w:pPr>
+        <w:pStyle w:val="BodyText"/>
+        <w:numPr>
+          <w:ilvl w:val="0"/>
+          <w:numId w:val="2"/>
+        </w:numPr>
+        <w:tabs>
+          <w:tab w:val="clear" w:pos="709"/>
+          <w:tab w:val="left" w:pos="0" w:leader="none"/>
+        </w:tabs>
+        <w:bidi w:val="0"/>
+        <w:spacing w:before="0" w:after="0"/>
+        <w:ind w:hanging="283" w:start="709" w:end="0"/>
+        <w:rPr>
+          <w:rFonts w:ascii="sans-serif" w:hAnsi="sans-serif"/>
+          <w:color w:val="000000"/>
+          <w:shd w:fill="auto" w:val="clear"/>
+        </w:rPr>
+      </w:pPr>
+      <w:r>
+        <w:rPr>
+          <w:rFonts w:ascii="sans-serif" w:hAnsi="sans-serif"/>
+          <w:color w:val="000000"/>
+          <w:shd w:fill="auto" w:val="clear"/>
+        </w:rPr>
+        <w:t>Día 5: Checkpoint</w:t>
+      </w:r>
+    </w:p>
+    <w:p>
+      <w:pPr>
+        <w:pStyle w:val="BodyText"/>
+        <w:spacing w:before="200" w:after="120"/>
+        <w:ind w:hanging="0" w:start="0" w:end="0"/>
+        <w:rPr>
+          <w:rFonts w:ascii="sans-serif" w:hAnsi="sans-serif"/>
+          <w:color w:val="000000"/>
+          <w:shd w:fill="auto" w:val="clear"/>
+        </w:rPr>
+      </w:pPr>
+      <w:r>
+        <w:rPr>
+          <w:rFonts w:ascii="sans-serif" w:hAnsi="sans-serif"/>
+          <w:color w:val="000000"/>
+          <w:shd w:fill="auto" w:val="clear"/>
+        </w:rPr>
+        <w:t>SEMANA 3: Encapsulación y composición</w:t>
+      </w:r>
+    </w:p>
+    <w:p>
+      <w:pPr>
+        <w:pStyle w:val="BodyText"/>
+        <w:numPr>
+          <w:ilvl w:val="0"/>
+          <w:numId w:val="3"/>
+        </w:numPr>
+        <w:tabs>
+          <w:tab w:val="clear" w:pos="709"/>
+          <w:tab w:val="left" w:pos="0" w:leader="none"/>
+        </w:tabs>
+        <w:bidi w:val="0"/>
+        <w:spacing w:before="0" w:after="0"/>
+        <w:ind w:hanging="283" w:start="709" w:end="0"/>
+        <w:rPr>
+          <w:rFonts w:ascii="sans-serif" w:hAnsi="sans-serif"/>
+          <w:color w:val="000000"/>
+          <w:shd w:fill="auto" w:val="clear"/>
+        </w:rPr>
+      </w:pPr>
+      <w:r>
+        <w:rPr>
+          <w:rFonts w:ascii="sans-serif" w:hAnsi="sans-serif"/>
+          <w:color w:val="000000"/>
+          <w:shd w:fill="auto" w:val="clear"/>
+        </w:rPr>
+        <w:t>Día 1-3: _vida, getters/setters, Inventario has-a</w:t>
+      </w:r>
+    </w:p>
+    <w:p>
+      <w:pPr>
+        <w:pStyle w:val="BodyText"/>
+        <w:numPr>
+          <w:ilvl w:val="0"/>
+          <w:numId w:val="3"/>
+        </w:numPr>
+        <w:tabs>
+          <w:tab w:val="clear" w:pos="709"/>
+          <w:tab w:val="left" w:pos="0" w:leader="none"/>
+        </w:tabs>
+        <w:bidi w:val="0"/>
+        <w:spacing w:before="0" w:after="0"/>
+        <w:ind w:hanging="283" w:start="709" w:end="0"/>
+        <w:rPr>
+          <w:rFonts w:ascii="sans-serif" w:hAnsi="sans-serif"/>
+          <w:color w:val="000000"/>
+          <w:shd w:fill="auto" w:val="clear"/>
+        </w:rPr>
+      </w:pPr>
+      <w:r>
+        <w:rPr>
+          <w:rFonts w:ascii="sans-serif" w:hAnsi="sans-serif"/>
+          <w:color w:val="000000"/>
+          <w:shd w:fill="auto" w:val="clear"/>
+        </w:rPr>
+        <w:t>Día 4: Huecos + pruebas</w:t>
+      </w:r>
+    </w:p>
+    <w:p>
+      <w:pPr>
+        <w:pStyle w:val="BodyText"/>
+        <w:numPr>
+          <w:ilvl w:val="0"/>
+          <w:numId w:val="3"/>
+        </w:numPr>
+        <w:tabs>
+          <w:tab w:val="clear" w:pos="709"/>
+          <w:tab w:val="left" w:pos="0" w:leader="none"/>
+        </w:tabs>
+        <w:bidi w:val="0"/>
+        <w:spacing w:before="0" w:after="0"/>
+        <w:ind w:hanging="283" w:start="709" w:end="0"/>
+        <w:rPr>
+          <w:rFonts w:ascii="sans-serif" w:hAnsi="sans-serif"/>
+          <w:color w:val="000000"/>
+          <w:shd w:fill="auto" w:val="clear"/>
+        </w:rPr>
+      </w:pPr>
+      <w:r>
+        <w:rPr>
+          <w:rFonts w:ascii="sans-serif" w:hAnsi="sans-serif"/>
+          <w:color w:val="000000"/>
+          <w:shd w:fill="auto" w:val="clear"/>
+        </w:rPr>
+        <w:t>Día 5: Checkpoint</w:t>
+      </w:r>
+    </w:p>
+    <w:p>
+      <w:pPr>
+        <w:pStyle w:val="BodyText"/>
+        <w:spacing w:before="200" w:after="120"/>
+        <w:ind w:hanging="0" w:start="0" w:end="0"/>
+        <w:rPr>
+          <w:rFonts w:ascii="sans-serif" w:hAnsi="sans-serif"/>
+          <w:color w:val="000000"/>
+          <w:shd w:fill="auto" w:val="clear"/>
+        </w:rPr>
+      </w:pPr>
+      <w:r>
+        <w:rPr>
+          <w:rFonts w:ascii="sans-serif" w:hAnsi="sans-serif"/>
+          <w:color w:val="000000"/>
+          <w:shd w:fill="auto" w:val="clear"/>
+        </w:rPr>
+        <w:t>SEMANA 4: Métodos especiales y diseño</w:t>
+      </w:r>
+    </w:p>
+    <w:p>
+      <w:pPr>
+        <w:pStyle w:val="BodyText"/>
+        <w:numPr>
+          <w:ilvl w:val="0"/>
+          <w:numId w:val="4"/>
+        </w:numPr>
+        <w:tabs>
+          <w:tab w:val="clear" w:pos="709"/>
+          <w:tab w:val="left" w:pos="0" w:leader="none"/>
+        </w:tabs>
+        <w:bidi w:val="0"/>
+        <w:spacing w:before="0" w:after="0"/>
+        <w:ind w:hanging="283" w:start="709" w:end="0"/>
+        <w:rPr>
+          <w:rFonts w:ascii="sans-serif" w:hAnsi="sans-serif"/>
+          <w:color w:val="000000"/>
+          <w:shd w:fill="auto" w:val="clear"/>
+        </w:rPr>
+      </w:pPr>
+      <w:r>
+        <w:rPr>
+          <w:rFonts w:ascii="sans-serif" w:hAnsi="sans-serif"/>
+          <w:color w:val="000000"/>
+          <w:shd w:fill="auto" w:val="clear"/>
+        </w:rPr>
+        <w:t>Día 1-3: str, eq, factory methods</w:t>
+      </w:r>
+    </w:p>
+    <w:p>
+      <w:pPr>
+        <w:pStyle w:val="BodyText"/>
+        <w:numPr>
+          <w:ilvl w:val="0"/>
+          <w:numId w:val="4"/>
+        </w:numPr>
+        <w:tabs>
+          <w:tab w:val="clear" w:pos="709"/>
+          <w:tab w:val="left" w:pos="0" w:leader="none"/>
+        </w:tabs>
+        <w:bidi w:val="0"/>
+        <w:spacing w:before="0" w:after="0"/>
+        <w:ind w:hanging="283" w:start="709" w:end="0"/>
+        <w:rPr>
+          <w:rFonts w:ascii="sans-serif" w:hAnsi="sans-serif"/>
+          <w:color w:val="000000"/>
+          <w:shd w:fill="auto" w:val="clear"/>
+        </w:rPr>
+      </w:pPr>
+      <w:r>
+        <w:rPr>
+          <w:rFonts w:ascii="sans-serif" w:hAnsi="sans-serif"/>
+          <w:color w:val="000000"/>
+          <w:shd w:fill="auto" w:val="clear"/>
+        </w:rPr>
+        <w:t>Día 4-5: Aplicación al RPG</w:t>
+      </w:r>
+    </w:p>
+    <w:p>
+      <w:pPr>
+        <w:pStyle w:val="BodyText"/>
+        <w:spacing w:before="200" w:after="120"/>
+        <w:ind w:hanging="0" w:start="0" w:end="0"/>
+        <w:rPr>
+          <w:rFonts w:ascii="sans-serif" w:hAnsi="sans-serif"/>
+          <w:color w:val="000000"/>
+          <w:shd w:fill="auto" w:val="clear"/>
+        </w:rPr>
+      </w:pPr>
+      <w:r>
+        <w:rPr>
+          <w:rFonts w:ascii="sans-serif" w:hAnsi="sans-serif"/>
+          <w:color w:val="000000"/>
+          <w:shd w:fill="auto" w:val="clear"/>
+        </w:rPr>
+        <w:t>SEMANA 5: Persistencia avanzada</w:t>
+      </w:r>
+    </w:p>
+    <w:p>
+      <w:pPr>
+        <w:pStyle w:val="BodyText"/>
+        <w:numPr>
+          <w:ilvl w:val="0"/>
+          <w:numId w:val="5"/>
+        </w:numPr>
+        <w:tabs>
+          <w:tab w:val="clear" w:pos="709"/>
+          <w:tab w:val="left" w:pos="0" w:leader="none"/>
+        </w:tabs>
+        <w:bidi w:val="0"/>
+        <w:spacing w:before="0" w:after="0"/>
+        <w:ind w:hanging="283" w:start="709" w:end="0"/>
+        <w:rPr>
+          <w:rFonts w:ascii="sans-serif" w:hAnsi="sans-serif"/>
+          <w:color w:val="000000"/>
+          <w:shd w:fill="auto" w:val="clear"/>
+        </w:rPr>
+      </w:pPr>
+      <w:r>
+        <w:rPr>
+          <w:rFonts w:ascii="sans-serif" w:hAnsi="sans-serif"/>
+          <w:color w:val="000000"/>
+          <w:shd w:fill="auto" w:val="clear"/>
+        </w:rPr>
+        <w:t>Día 1-3: JSON de objetos complejos</w:t>
+      </w:r>
+    </w:p>
+    <w:p>
+      <w:pPr>
+        <w:pStyle w:val="BodyText"/>
+        <w:numPr>
+          <w:ilvl w:val="0"/>
+          <w:numId w:val="5"/>
+        </w:numPr>
+        <w:tabs>
+          <w:tab w:val="clear" w:pos="709"/>
+          <w:tab w:val="left" w:pos="0" w:leader="none"/>
+        </w:tabs>
+        <w:bidi w:val="0"/>
+        <w:spacing w:before="0" w:after="0"/>
+        <w:ind w:hanging="283" w:start="709" w:end="0"/>
+        <w:rPr>
+          <w:rFonts w:ascii="sans-serif" w:hAnsi="sans-serif"/>
+          <w:color w:val="000000"/>
+          <w:shd w:fill="auto" w:val="clear"/>
+        </w:rPr>
+      </w:pPr>
+      <w:r>
+        <w:rPr>
+          <w:rFonts w:ascii="sans-serif" w:hAnsi="sans-serif"/>
+          <w:color w:val="000000"/>
+          <w:shd w:fill="auto" w:val="clear"/>
+        </w:rPr>
+        <w:t>Día 4-5: Checkpoint</w:t>
+      </w:r>
+    </w:p>
+    <w:p>
+      <w:pPr>
+        <w:pStyle w:val="BodyText"/>
+        <w:spacing w:before="200" w:after="120"/>
+        <w:ind w:hanging="0" w:start="0" w:end="0"/>
+        <w:rPr>
+          <w:rFonts w:ascii="sans-serif" w:hAnsi="sans-serif"/>
+          <w:color w:val="000000"/>
+          <w:shd w:fill="auto" w:val="clear"/>
+        </w:rPr>
+      </w:pPr>
+      <w:r>
+        <w:rPr>
+          <w:rFonts w:ascii="sans-serif" w:hAnsi="sans-serif"/>
+          <w:color w:val="000000"/>
+          <w:shd w:fill="auto" w:val="clear"/>
+        </w:rPr>
+        <w:t>SEMANA 6: Integración y extensión</w:t>
+      </w:r>
+    </w:p>
+    <w:p>
+      <w:pPr>
+        <w:pStyle w:val="BodyText"/>
+        <w:numPr>
+          <w:ilvl w:val="0"/>
+          <w:numId w:val="6"/>
+        </w:numPr>
+        <w:tabs>
+          <w:tab w:val="clear" w:pos="709"/>
+          <w:tab w:val="left" w:pos="0" w:leader="none"/>
+        </w:tabs>
+        <w:bidi w:val="0"/>
+        <w:spacing w:before="0" w:after="0"/>
+        <w:ind w:hanging="283" w:start="709" w:end="0"/>
+        <w:rPr>
+          <w:rFonts w:ascii="sans-serif" w:hAnsi="sans-serif"/>
+          <w:color w:val="000000"/>
+          <w:shd w:fill="auto" w:val="clear"/>
+        </w:rPr>
+      </w:pPr>
+      <w:r>
+        <w:rPr>
+          <w:rFonts w:ascii="sans-serif" w:hAnsi="sans-serif"/>
+          <w:color w:val="000000"/>
+          <w:shd w:fill="auto" w:val="clear"/>
+        </w:rPr>
+        <w:t>Día 1-5: Añadir feature POO (ej. experiencia)</w:t>
+      </w:r>
+    </w:p>
+    <w:p>
+      <w:pPr>
+        <w:pStyle w:val="BodyText"/>
+        <w:numPr>
+          <w:ilvl w:val="0"/>
+          <w:numId w:val="6"/>
+        </w:numPr>
+        <w:tabs>
+          <w:tab w:val="clear" w:pos="709"/>
+          <w:tab w:val="left" w:pos="0" w:leader="none"/>
+        </w:tabs>
+        <w:bidi w:val="0"/>
+        <w:spacing w:before="0" w:after="0"/>
+        <w:ind w:hanging="283" w:start="709" w:end="0"/>
+        <w:rPr>
+          <w:rFonts w:ascii="sans-serif" w:hAnsi="sans-serif"/>
+          <w:color w:val="000000"/>
+          <w:shd w:fill="auto" w:val="clear"/>
+        </w:rPr>
+      </w:pPr>
+      <w:r>
+        <w:rPr>
+          <w:rFonts w:ascii="sans-serif" w:hAnsi="sans-serif"/>
+          <w:color w:val="000000"/>
+          <w:shd w:fill="auto" w:val="clear"/>
+        </w:rPr>
+        <w:t>Final: Auto-evaluación</w:t>
       </w:r>
     </w:p>
     <w:p>
@@ -146,6 +617,973 @@
     </w:sectPr>
   </w:body>
 </w:document>
+</file>
+
+<file path=word/numbering.xml><?xml version="1.0" encoding="utf-8"?>
+<w:numbering xmlns:w="http://schemas.openxmlformats.org/wordprocessingml/2006/main" xmlns:o="urn:schemas-microsoft-com:office:office" xmlns:r="http://schemas.openxmlformats.org/officeDocument/2006/relationships" xmlns:v="urn:schemas-microsoft-com:vml" xmlns:mc="http://schemas.openxmlformats.org/markup-compatibility/2006" xmlns:w14="http://schemas.microsoft.com/office/word/2010/wordml" mc:Ignorable="w14">
+  <w:abstractNum w:abstractNumId="1">
+    <w:lvl w:ilvl="0">
+      <w:start w:val="1"/>
+      <w:numFmt w:val="bullet"/>
+      <w:lvlText w:val=""/>
+      <w:lvlJc w:val="start"/>
+      <w:pPr>
+        <w:tabs>
+          <w:tab w:val="num" w:pos="709"/>
+        </w:tabs>
+        <w:ind w:start="709" w:hanging="283"/>
+      </w:pPr>
+      <w:rPr>
+        <w:rFonts w:ascii="Wingdings" w:hAnsi="Wingdings" w:cs="Wingdings" w:hint="default"/>
+      </w:rPr>
+    </w:lvl>
+    <w:lvl w:ilvl="1">
+      <w:start w:val="1"/>
+      <w:numFmt w:val="bullet"/>
+      <w:lvlText w:val=""/>
+      <w:lvlJc w:val="start"/>
+      <w:pPr>
+        <w:tabs>
+          <w:tab w:val="num" w:pos="1418"/>
+        </w:tabs>
+        <w:ind w:start="1418" w:hanging="283"/>
+      </w:pPr>
+      <w:rPr>
+        <w:rFonts w:ascii="Symbol" w:hAnsi="Symbol" w:cs="Symbol" w:hint="default"/>
+      </w:rPr>
+    </w:lvl>
+    <w:lvl w:ilvl="2">
+      <w:start w:val="1"/>
+      <w:numFmt w:val="bullet"/>
+      <w:lvlText w:val=""/>
+      <w:lvlJc w:val="start"/>
+      <w:pPr>
+        <w:tabs>
+          <w:tab w:val="num" w:pos="2127"/>
+        </w:tabs>
+        <w:ind w:start="2127" w:hanging="283"/>
+      </w:pPr>
+      <w:rPr>
+        <w:rFonts w:ascii="Symbol" w:hAnsi="Symbol" w:cs="Symbol" w:hint="default"/>
+      </w:rPr>
+    </w:lvl>
+    <w:lvl w:ilvl="3">
+      <w:start w:val="1"/>
+      <w:numFmt w:val="bullet"/>
+      <w:lvlText w:val=""/>
+      <w:lvlJc w:val="start"/>
+      <w:pPr>
+        <w:tabs>
+          <w:tab w:val="num" w:pos="2836"/>
+        </w:tabs>
+        <w:ind w:start="2836" w:hanging="283"/>
+      </w:pPr>
+      <w:rPr>
+        <w:rFonts w:ascii="Symbol" w:hAnsi="Symbol" w:cs="Symbol" w:hint="default"/>
+      </w:rPr>
+    </w:lvl>
+    <w:lvl w:ilvl="4">
+      <w:start w:val="1"/>
+      <w:numFmt w:val="bullet"/>
+      <w:lvlText w:val=""/>
+      <w:lvlJc w:val="start"/>
+      <w:pPr>
+        <w:tabs>
+          <w:tab w:val="num" w:pos="3545"/>
+        </w:tabs>
+        <w:ind w:start="3545" w:hanging="283"/>
+      </w:pPr>
+      <w:rPr>
+        <w:rFonts w:ascii="Symbol" w:hAnsi="Symbol" w:cs="Symbol" w:hint="default"/>
+      </w:rPr>
+    </w:lvl>
+    <w:lvl w:ilvl="5">
+      <w:start w:val="1"/>
+      <w:numFmt w:val="bullet"/>
+      <w:lvlText w:val=""/>
+      <w:lvlJc w:val="start"/>
+      <w:pPr>
+        <w:tabs>
+          <w:tab w:val="num" w:pos="4254"/>
+        </w:tabs>
+        <w:ind w:start="4254" w:hanging="283"/>
+      </w:pPr>
+      <w:rPr>
+        <w:rFonts w:ascii="Symbol" w:hAnsi="Symbol" w:cs="Symbol" w:hint="default"/>
+      </w:rPr>
+    </w:lvl>
+    <w:lvl w:ilvl="6">
+      <w:start w:val="1"/>
+      <w:numFmt w:val="bullet"/>
+      <w:lvlText w:val=""/>
+      <w:lvlJc w:val="start"/>
+      <w:pPr>
+        <w:tabs>
+          <w:tab w:val="num" w:pos="4963"/>
+        </w:tabs>
+        <w:ind w:start="4963" w:hanging="283"/>
+      </w:pPr>
+      <w:rPr>
+        <w:rFonts w:ascii="Symbol" w:hAnsi="Symbol" w:cs="Symbol" w:hint="default"/>
+      </w:rPr>
+    </w:lvl>
+    <w:lvl w:ilvl="7">
+      <w:start w:val="1"/>
+      <w:numFmt w:val="bullet"/>
+      <w:lvlText w:val=""/>
+      <w:lvlJc w:val="start"/>
+      <w:pPr>
+        <w:tabs>
+          <w:tab w:val="num" w:pos="5672"/>
+        </w:tabs>
+        <w:ind w:start="5672" w:hanging="283"/>
+      </w:pPr>
+      <w:rPr>
+        <w:rFonts w:ascii="Symbol" w:hAnsi="Symbol" w:cs="Symbol" w:hint="default"/>
+      </w:rPr>
+    </w:lvl>
+    <w:lvl w:ilvl="8">
+      <w:start w:val="1"/>
+      <w:numFmt w:val="bullet"/>
+      <w:lvlText w:val=""/>
+      <w:lvlJc w:val="start"/>
+      <w:pPr>
+        <w:tabs>
+          <w:tab w:val="num" w:pos="6381"/>
+        </w:tabs>
+        <w:ind w:start="6381" w:hanging="283"/>
+      </w:pPr>
+      <w:rPr>
+        <w:rFonts w:ascii="Symbol" w:hAnsi="Symbol" w:cs="Symbol" w:hint="default"/>
+      </w:rPr>
+    </w:lvl>
+  </w:abstractNum>
+  <w:abstractNum w:abstractNumId="2">
+    <w:lvl w:ilvl="0">
+      <w:start w:val="1"/>
+      <w:numFmt w:val="bullet"/>
+      <w:lvlText w:val=""/>
+      <w:lvlJc w:val="start"/>
+      <w:pPr>
+        <w:tabs>
+          <w:tab w:val="num" w:pos="709"/>
+        </w:tabs>
+        <w:ind w:start="709" w:hanging="283"/>
+      </w:pPr>
+      <w:rPr>
+        <w:rFonts w:ascii="Wingdings" w:hAnsi="Wingdings" w:cs="Wingdings" w:hint="default"/>
+      </w:rPr>
+    </w:lvl>
+    <w:lvl w:ilvl="1">
+      <w:start w:val="1"/>
+      <w:numFmt w:val="bullet"/>
+      <w:lvlText w:val=""/>
+      <w:lvlJc w:val="start"/>
+      <w:pPr>
+        <w:tabs>
+          <w:tab w:val="num" w:pos="1418"/>
+        </w:tabs>
+        <w:ind w:start="1418" w:hanging="283"/>
+      </w:pPr>
+      <w:rPr>
+        <w:rFonts w:ascii="Symbol" w:hAnsi="Symbol" w:cs="Symbol" w:hint="default"/>
+      </w:rPr>
+    </w:lvl>
+    <w:lvl w:ilvl="2">
+      <w:start w:val="1"/>
+      <w:numFmt w:val="bullet"/>
+      <w:lvlText w:val=""/>
+      <w:lvlJc w:val="start"/>
+      <w:pPr>
+        <w:tabs>
+          <w:tab w:val="num" w:pos="2127"/>
+        </w:tabs>
+        <w:ind w:start="2127" w:hanging="283"/>
+      </w:pPr>
+      <w:rPr>
+        <w:rFonts w:ascii="Symbol" w:hAnsi="Symbol" w:cs="Symbol" w:hint="default"/>
+      </w:rPr>
+    </w:lvl>
+    <w:lvl w:ilvl="3">
+      <w:start w:val="1"/>
+      <w:numFmt w:val="bullet"/>
+      <w:lvlText w:val=""/>
+      <w:lvlJc w:val="start"/>
+      <w:pPr>
+        <w:tabs>
+          <w:tab w:val="num" w:pos="2836"/>
+        </w:tabs>
+        <w:ind w:start="2836" w:hanging="283"/>
+      </w:pPr>
+      <w:rPr>
+        <w:rFonts w:ascii="Symbol" w:hAnsi="Symbol" w:cs="Symbol" w:hint="default"/>
+      </w:rPr>
+    </w:lvl>
+    <w:lvl w:ilvl="4">
+      <w:start w:val="1"/>
+      <w:numFmt w:val="bullet"/>
+      <w:lvlText w:val=""/>
+      <w:lvlJc w:val="start"/>
+      <w:pPr>
+        <w:tabs>
+          <w:tab w:val="num" w:pos="3545"/>
+        </w:tabs>
+        <w:ind w:start="3545" w:hanging="283"/>
+      </w:pPr>
+      <w:rPr>
+        <w:rFonts w:ascii="Symbol" w:hAnsi="Symbol" w:cs="Symbol" w:hint="default"/>
+      </w:rPr>
+    </w:lvl>
+    <w:lvl w:ilvl="5">
+      <w:start w:val="1"/>
+      <w:numFmt w:val="bullet"/>
+      <w:lvlText w:val=""/>
+      <w:lvlJc w:val="start"/>
+      <w:pPr>
+        <w:tabs>
+          <w:tab w:val="num" w:pos="4254"/>
+        </w:tabs>
+        <w:ind w:start="4254" w:hanging="283"/>
+      </w:pPr>
+      <w:rPr>
+        <w:rFonts w:ascii="Symbol" w:hAnsi="Symbol" w:cs="Symbol" w:hint="default"/>
+      </w:rPr>
+    </w:lvl>
+    <w:lvl w:ilvl="6">
+      <w:start w:val="1"/>
+      <w:numFmt w:val="bullet"/>
+      <w:lvlText w:val=""/>
+      <w:lvlJc w:val="start"/>
+      <w:pPr>
+        <w:tabs>
+          <w:tab w:val="num" w:pos="4963"/>
+        </w:tabs>
+        <w:ind w:start="4963" w:hanging="283"/>
+      </w:pPr>
+      <w:rPr>
+        <w:rFonts w:ascii="Symbol" w:hAnsi="Symbol" w:cs="Symbol" w:hint="default"/>
+      </w:rPr>
+    </w:lvl>
+    <w:lvl w:ilvl="7">
+      <w:start w:val="1"/>
+      <w:numFmt w:val="bullet"/>
+      <w:lvlText w:val=""/>
+      <w:lvlJc w:val="start"/>
+      <w:pPr>
+        <w:tabs>
+          <w:tab w:val="num" w:pos="5672"/>
+        </w:tabs>
+        <w:ind w:start="5672" w:hanging="283"/>
+      </w:pPr>
+      <w:rPr>
+        <w:rFonts w:ascii="Symbol" w:hAnsi="Symbol" w:cs="Symbol" w:hint="default"/>
+      </w:rPr>
+    </w:lvl>
+    <w:lvl w:ilvl="8">
+      <w:start w:val="1"/>
+      <w:numFmt w:val="bullet"/>
+      <w:lvlText w:val=""/>
+      <w:lvlJc w:val="start"/>
+      <w:pPr>
+        <w:tabs>
+          <w:tab w:val="num" w:pos="6381"/>
+        </w:tabs>
+        <w:ind w:start="6381" w:hanging="283"/>
+      </w:pPr>
+      <w:rPr>
+        <w:rFonts w:ascii="Symbol" w:hAnsi="Symbol" w:cs="Symbol" w:hint="default"/>
+      </w:rPr>
+    </w:lvl>
+  </w:abstractNum>
+  <w:abstractNum w:abstractNumId="3">
+    <w:lvl w:ilvl="0">
+      <w:start w:val="1"/>
+      <w:numFmt w:val="bullet"/>
+      <w:lvlText w:val=""/>
+      <w:lvlJc w:val="start"/>
+      <w:pPr>
+        <w:tabs>
+          <w:tab w:val="num" w:pos="709"/>
+        </w:tabs>
+        <w:ind w:start="709" w:hanging="283"/>
+      </w:pPr>
+      <w:rPr>
+        <w:rFonts w:ascii="Wingdings" w:hAnsi="Wingdings" w:cs="Wingdings" w:hint="default"/>
+      </w:rPr>
+    </w:lvl>
+    <w:lvl w:ilvl="1">
+      <w:start w:val="1"/>
+      <w:numFmt w:val="bullet"/>
+      <w:lvlText w:val=""/>
+      <w:lvlJc w:val="start"/>
+      <w:pPr>
+        <w:tabs>
+          <w:tab w:val="num" w:pos="1418"/>
+        </w:tabs>
+        <w:ind w:start="1418" w:hanging="283"/>
+      </w:pPr>
+      <w:rPr>
+        <w:rFonts w:ascii="Symbol" w:hAnsi="Symbol" w:cs="Symbol" w:hint="default"/>
+      </w:rPr>
+    </w:lvl>
+    <w:lvl w:ilvl="2">
+      <w:start w:val="1"/>
+      <w:numFmt w:val="bullet"/>
+      <w:lvlText w:val=""/>
+      <w:lvlJc w:val="start"/>
+      <w:pPr>
+        <w:tabs>
+          <w:tab w:val="num" w:pos="2127"/>
+        </w:tabs>
+        <w:ind w:start="2127" w:hanging="283"/>
+      </w:pPr>
+      <w:rPr>
+        <w:rFonts w:ascii="Symbol" w:hAnsi="Symbol" w:cs="Symbol" w:hint="default"/>
+      </w:rPr>
+    </w:lvl>
+    <w:lvl w:ilvl="3">
+      <w:start w:val="1"/>
+      <w:numFmt w:val="bullet"/>
+      <w:lvlText w:val=""/>
+      <w:lvlJc w:val="start"/>
+      <w:pPr>
+        <w:tabs>
+          <w:tab w:val="num" w:pos="2836"/>
+        </w:tabs>
+        <w:ind w:start="2836" w:hanging="283"/>
+      </w:pPr>
+      <w:rPr>
+        <w:rFonts w:ascii="Symbol" w:hAnsi="Symbol" w:cs="Symbol" w:hint="default"/>
+      </w:rPr>
+    </w:lvl>
+    <w:lvl w:ilvl="4">
+      <w:start w:val="1"/>
+      <w:numFmt w:val="bullet"/>
+      <w:lvlText w:val=""/>
+      <w:lvlJc w:val="start"/>
+      <w:pPr>
+        <w:tabs>
+          <w:tab w:val="num" w:pos="3545"/>
+        </w:tabs>
+        <w:ind w:start="3545" w:hanging="283"/>
+      </w:pPr>
+      <w:rPr>
+        <w:rFonts w:ascii="Symbol" w:hAnsi="Symbol" w:cs="Symbol" w:hint="default"/>
+      </w:rPr>
+    </w:lvl>
+    <w:lvl w:ilvl="5">
+      <w:start w:val="1"/>
+      <w:numFmt w:val="bullet"/>
+      <w:lvlText w:val=""/>
+      <w:lvlJc w:val="start"/>
+      <w:pPr>
+        <w:tabs>
+          <w:tab w:val="num" w:pos="4254"/>
+        </w:tabs>
+        <w:ind w:start="4254" w:hanging="283"/>
+      </w:pPr>
+      <w:rPr>
+        <w:rFonts w:ascii="Symbol" w:hAnsi="Symbol" w:cs="Symbol" w:hint="default"/>
+      </w:rPr>
+    </w:lvl>
+    <w:lvl w:ilvl="6">
+      <w:start w:val="1"/>
+      <w:numFmt w:val="bullet"/>
+      <w:lvlText w:val=""/>
+      <w:lvlJc w:val="start"/>
+      <w:pPr>
+        <w:tabs>
+          <w:tab w:val="num" w:pos="4963"/>
+        </w:tabs>
+        <w:ind w:start="4963" w:hanging="283"/>
+      </w:pPr>
+      <w:rPr>
+        <w:rFonts w:ascii="Symbol" w:hAnsi="Symbol" w:cs="Symbol" w:hint="default"/>
+      </w:rPr>
+    </w:lvl>
+    <w:lvl w:ilvl="7">
+      <w:start w:val="1"/>
+      <w:numFmt w:val="bullet"/>
+      <w:lvlText w:val=""/>
+      <w:lvlJc w:val="start"/>
+      <w:pPr>
+        <w:tabs>
+          <w:tab w:val="num" w:pos="5672"/>
+        </w:tabs>
+        <w:ind w:start="5672" w:hanging="283"/>
+      </w:pPr>
+      <w:rPr>
+        <w:rFonts w:ascii="Symbol" w:hAnsi="Symbol" w:cs="Symbol" w:hint="default"/>
+      </w:rPr>
+    </w:lvl>
+    <w:lvl w:ilvl="8">
+      <w:start w:val="1"/>
+      <w:numFmt w:val="bullet"/>
+      <w:lvlText w:val=""/>
+      <w:lvlJc w:val="start"/>
+      <w:pPr>
+        <w:tabs>
+          <w:tab w:val="num" w:pos="6381"/>
+        </w:tabs>
+        <w:ind w:start="6381" w:hanging="283"/>
+      </w:pPr>
+      <w:rPr>
+        <w:rFonts w:ascii="Symbol" w:hAnsi="Symbol" w:cs="Symbol" w:hint="default"/>
+      </w:rPr>
+    </w:lvl>
+  </w:abstractNum>
+  <w:abstractNum w:abstractNumId="4">
+    <w:lvl w:ilvl="0">
+      <w:start w:val="1"/>
+      <w:numFmt w:val="bullet"/>
+      <w:lvlText w:val=""/>
+      <w:lvlJc w:val="start"/>
+      <w:pPr>
+        <w:tabs>
+          <w:tab w:val="num" w:pos="709"/>
+        </w:tabs>
+        <w:ind w:start="709" w:hanging="283"/>
+      </w:pPr>
+      <w:rPr>
+        <w:rFonts w:ascii="Wingdings" w:hAnsi="Wingdings" w:cs="Wingdings" w:hint="default"/>
+      </w:rPr>
+    </w:lvl>
+    <w:lvl w:ilvl="1">
+      <w:start w:val="1"/>
+      <w:numFmt w:val="bullet"/>
+      <w:lvlText w:val=""/>
+      <w:lvlJc w:val="start"/>
+      <w:pPr>
+        <w:tabs>
+          <w:tab w:val="num" w:pos="1418"/>
+        </w:tabs>
+        <w:ind w:start="1418" w:hanging="283"/>
+      </w:pPr>
+      <w:rPr>
+        <w:rFonts w:ascii="Symbol" w:hAnsi="Symbol" w:cs="Symbol" w:hint="default"/>
+      </w:rPr>
+    </w:lvl>
+    <w:lvl w:ilvl="2">
+      <w:start w:val="1"/>
+      <w:numFmt w:val="bullet"/>
+      <w:lvlText w:val=""/>
+      <w:lvlJc w:val="start"/>
+      <w:pPr>
+        <w:tabs>
+          <w:tab w:val="num" w:pos="2127"/>
+        </w:tabs>
+        <w:ind w:start="2127" w:hanging="283"/>
+      </w:pPr>
+      <w:rPr>
+        <w:rFonts w:ascii="Symbol" w:hAnsi="Symbol" w:cs="Symbol" w:hint="default"/>
+      </w:rPr>
+    </w:lvl>
+    <w:lvl w:ilvl="3">
+      <w:start w:val="1"/>
+      <w:numFmt w:val="bullet"/>
+      <w:lvlText w:val=""/>
+      <w:lvlJc w:val="start"/>
+      <w:pPr>
+        <w:tabs>
+          <w:tab w:val="num" w:pos="2836"/>
+        </w:tabs>
+        <w:ind w:start="2836" w:hanging="283"/>
+      </w:pPr>
+      <w:rPr>
+        <w:rFonts w:ascii="Symbol" w:hAnsi="Symbol" w:cs="Symbol" w:hint="default"/>
+      </w:rPr>
+    </w:lvl>
+    <w:lvl w:ilvl="4">
+      <w:start w:val="1"/>
+      <w:numFmt w:val="bullet"/>
+      <w:lvlText w:val=""/>
+      <w:lvlJc w:val="start"/>
+      <w:pPr>
+        <w:tabs>
+          <w:tab w:val="num" w:pos="3545"/>
+        </w:tabs>
+        <w:ind w:start="3545" w:hanging="283"/>
+      </w:pPr>
+      <w:rPr>
+        <w:rFonts w:ascii="Symbol" w:hAnsi="Symbol" w:cs="Symbol" w:hint="default"/>
+      </w:rPr>
+    </w:lvl>
+    <w:lvl w:ilvl="5">
+      <w:start w:val="1"/>
+      <w:numFmt w:val="bullet"/>
+      <w:lvlText w:val=""/>
+      <w:lvlJc w:val="start"/>
+      <w:pPr>
+        <w:tabs>
+          <w:tab w:val="num" w:pos="4254"/>
+        </w:tabs>
+        <w:ind w:start="4254" w:hanging="283"/>
+      </w:pPr>
+      <w:rPr>
+        <w:rFonts w:ascii="Symbol" w:hAnsi="Symbol" w:cs="Symbol" w:hint="default"/>
+      </w:rPr>
+    </w:lvl>
+    <w:lvl w:ilvl="6">
+      <w:start w:val="1"/>
+      <w:numFmt w:val="bullet"/>
+      <w:lvlText w:val=""/>
+      <w:lvlJc w:val="start"/>
+      <w:pPr>
+        <w:tabs>
+          <w:tab w:val="num" w:pos="4963"/>
+        </w:tabs>
+        <w:ind w:start="4963" w:hanging="283"/>
+      </w:pPr>
+      <w:rPr>
+        <w:rFonts w:ascii="Symbol" w:hAnsi="Symbol" w:cs="Symbol" w:hint="default"/>
+      </w:rPr>
+    </w:lvl>
+    <w:lvl w:ilvl="7">
+      <w:start w:val="1"/>
+      <w:numFmt w:val="bullet"/>
+      <w:lvlText w:val=""/>
+      <w:lvlJc w:val="start"/>
+      <w:pPr>
+        <w:tabs>
+          <w:tab w:val="num" w:pos="5672"/>
+        </w:tabs>
+        <w:ind w:start="5672" w:hanging="283"/>
+      </w:pPr>
+      <w:rPr>
+        <w:rFonts w:ascii="Symbol" w:hAnsi="Symbol" w:cs="Symbol" w:hint="default"/>
+      </w:rPr>
+    </w:lvl>
+    <w:lvl w:ilvl="8">
+      <w:start w:val="1"/>
+      <w:numFmt w:val="bullet"/>
+      <w:lvlText w:val=""/>
+      <w:lvlJc w:val="start"/>
+      <w:pPr>
+        <w:tabs>
+          <w:tab w:val="num" w:pos="6381"/>
+        </w:tabs>
+        <w:ind w:start="6381" w:hanging="283"/>
+      </w:pPr>
+      <w:rPr>
+        <w:rFonts w:ascii="Symbol" w:hAnsi="Symbol" w:cs="Symbol" w:hint="default"/>
+      </w:rPr>
+    </w:lvl>
+  </w:abstractNum>
+  <w:abstractNum w:abstractNumId="5">
+    <w:lvl w:ilvl="0">
+      <w:start w:val="1"/>
+      <w:numFmt w:val="bullet"/>
+      <w:lvlText w:val=""/>
+      <w:lvlJc w:val="start"/>
+      <w:pPr>
+        <w:tabs>
+          <w:tab w:val="num" w:pos="709"/>
+        </w:tabs>
+        <w:ind w:start="709" w:hanging="283"/>
+      </w:pPr>
+      <w:rPr>
+        <w:rFonts w:ascii="Wingdings" w:hAnsi="Wingdings" w:cs="Wingdings" w:hint="default"/>
+      </w:rPr>
+    </w:lvl>
+    <w:lvl w:ilvl="1">
+      <w:start w:val="1"/>
+      <w:numFmt w:val="bullet"/>
+      <w:lvlText w:val=""/>
+      <w:lvlJc w:val="start"/>
+      <w:pPr>
+        <w:tabs>
+          <w:tab w:val="num" w:pos="1418"/>
+        </w:tabs>
+        <w:ind w:start="1418" w:hanging="283"/>
+      </w:pPr>
+      <w:rPr>
+        <w:rFonts w:ascii="Symbol" w:hAnsi="Symbol" w:cs="Symbol" w:hint="default"/>
+      </w:rPr>
+    </w:lvl>
+    <w:lvl w:ilvl="2">
+      <w:start w:val="1"/>
+      <w:numFmt w:val="bullet"/>
+      <w:lvlText w:val=""/>
+      <w:lvlJc w:val="start"/>
+      <w:pPr>
+        <w:tabs>
+          <w:tab w:val="num" w:pos="2127"/>
+        </w:tabs>
+        <w:ind w:start="2127" w:hanging="283"/>
+      </w:pPr>
+      <w:rPr>
+        <w:rFonts w:ascii="Symbol" w:hAnsi="Symbol" w:cs="Symbol" w:hint="default"/>
+      </w:rPr>
+    </w:lvl>
+    <w:lvl w:ilvl="3">
+      <w:start w:val="1"/>
+      <w:numFmt w:val="bullet"/>
+      <w:lvlText w:val=""/>
+      <w:lvlJc w:val="start"/>
+      <w:pPr>
+        <w:tabs>
+          <w:tab w:val="num" w:pos="2836"/>
+        </w:tabs>
+        <w:ind w:start="2836" w:hanging="283"/>
+      </w:pPr>
+      <w:rPr>
+        <w:rFonts w:ascii="Symbol" w:hAnsi="Symbol" w:cs="Symbol" w:hint="default"/>
+      </w:rPr>
+    </w:lvl>
+    <w:lvl w:ilvl="4">
+      <w:start w:val="1"/>
+      <w:numFmt w:val="bullet"/>
+      <w:lvlText w:val=""/>
+      <w:lvlJc w:val="start"/>
+      <w:pPr>
+        <w:tabs>
+          <w:tab w:val="num" w:pos="3545"/>
+        </w:tabs>
+        <w:ind w:start="3545" w:hanging="283"/>
+      </w:pPr>
+      <w:rPr>
+        <w:rFonts w:ascii="Symbol" w:hAnsi="Symbol" w:cs="Symbol" w:hint="default"/>
+      </w:rPr>
+    </w:lvl>
+    <w:lvl w:ilvl="5">
+      <w:start w:val="1"/>
+      <w:numFmt w:val="bullet"/>
+      <w:lvlText w:val=""/>
+      <w:lvlJc w:val="start"/>
+      <w:pPr>
+        <w:tabs>
+          <w:tab w:val="num" w:pos="4254"/>
+        </w:tabs>
+        <w:ind w:start="4254" w:hanging="283"/>
+      </w:pPr>
+      <w:rPr>
+        <w:rFonts w:ascii="Symbol" w:hAnsi="Symbol" w:cs="Symbol" w:hint="default"/>
+      </w:rPr>
+    </w:lvl>
+    <w:lvl w:ilvl="6">
+      <w:start w:val="1"/>
+      <w:numFmt w:val="bullet"/>
+      <w:lvlText w:val=""/>
+      <w:lvlJc w:val="start"/>
+      <w:pPr>
+        <w:tabs>
+          <w:tab w:val="num" w:pos="4963"/>
+        </w:tabs>
+        <w:ind w:start="4963" w:hanging="283"/>
+      </w:pPr>
+      <w:rPr>
+        <w:rFonts w:ascii="Symbol" w:hAnsi="Symbol" w:cs="Symbol" w:hint="default"/>
+      </w:rPr>
+    </w:lvl>
+    <w:lvl w:ilvl="7">
+      <w:start w:val="1"/>
+      <w:numFmt w:val="bullet"/>
+      <w:lvlText w:val=""/>
+      <w:lvlJc w:val="start"/>
+      <w:pPr>
+        <w:tabs>
+          <w:tab w:val="num" w:pos="5672"/>
+        </w:tabs>
+        <w:ind w:start="5672" w:hanging="283"/>
+      </w:pPr>
+      <w:rPr>
+        <w:rFonts w:ascii="Symbol" w:hAnsi="Symbol" w:cs="Symbol" w:hint="default"/>
+      </w:rPr>
+    </w:lvl>
+    <w:lvl w:ilvl="8">
+      <w:start w:val="1"/>
+      <w:numFmt w:val="bullet"/>
+      <w:lvlText w:val=""/>
+      <w:lvlJc w:val="start"/>
+      <w:pPr>
+        <w:tabs>
+          <w:tab w:val="num" w:pos="6381"/>
+        </w:tabs>
+        <w:ind w:start="6381" w:hanging="283"/>
+      </w:pPr>
+      <w:rPr>
+        <w:rFonts w:ascii="Symbol" w:hAnsi="Symbol" w:cs="Symbol" w:hint="default"/>
+      </w:rPr>
+    </w:lvl>
+  </w:abstractNum>
+  <w:abstractNum w:abstractNumId="6">
+    <w:lvl w:ilvl="0">
+      <w:start w:val="1"/>
+      <w:numFmt w:val="bullet"/>
+      <w:lvlText w:val=""/>
+      <w:lvlJc w:val="start"/>
+      <w:pPr>
+        <w:tabs>
+          <w:tab w:val="num" w:pos="709"/>
+        </w:tabs>
+        <w:ind w:start="709" w:hanging="283"/>
+      </w:pPr>
+      <w:rPr>
+        <w:rFonts w:ascii="Wingdings" w:hAnsi="Wingdings" w:cs="Wingdings" w:hint="default"/>
+      </w:rPr>
+    </w:lvl>
+    <w:lvl w:ilvl="1">
+      <w:start w:val="1"/>
+      <w:numFmt w:val="bullet"/>
+      <w:lvlText w:val=""/>
+      <w:lvlJc w:val="start"/>
+      <w:pPr>
+        <w:tabs>
+          <w:tab w:val="num" w:pos="1418"/>
+        </w:tabs>
+        <w:ind w:start="1418" w:hanging="283"/>
+      </w:pPr>
+      <w:rPr>
+        <w:rFonts w:ascii="Symbol" w:hAnsi="Symbol" w:cs="Symbol" w:hint="default"/>
+      </w:rPr>
+    </w:lvl>
+    <w:lvl w:ilvl="2">
+      <w:start w:val="1"/>
+      <w:numFmt w:val="bullet"/>
+      <w:lvlText w:val=""/>
+      <w:lvlJc w:val="start"/>
+      <w:pPr>
+        <w:tabs>
+          <w:tab w:val="num" w:pos="2127"/>
+        </w:tabs>
+        <w:ind w:start="2127" w:hanging="283"/>
+      </w:pPr>
+      <w:rPr>
+        <w:rFonts w:ascii="Symbol" w:hAnsi="Symbol" w:cs="Symbol" w:hint="default"/>
+      </w:rPr>
+    </w:lvl>
+    <w:lvl w:ilvl="3">
+      <w:start w:val="1"/>
+      <w:numFmt w:val="bullet"/>
+      <w:lvlText w:val=""/>
+      <w:lvlJc w:val="start"/>
+      <w:pPr>
+        <w:tabs>
+          <w:tab w:val="num" w:pos="2836"/>
+        </w:tabs>
+        <w:ind w:start="2836" w:hanging="283"/>
+      </w:pPr>
+      <w:rPr>
+        <w:rFonts w:ascii="Symbol" w:hAnsi="Symbol" w:cs="Symbol" w:hint="default"/>
+      </w:rPr>
+    </w:lvl>
+    <w:lvl w:ilvl="4">
+      <w:start w:val="1"/>
+      <w:numFmt w:val="bullet"/>
+      <w:lvlText w:val=""/>
+      <w:lvlJc w:val="start"/>
+      <w:pPr>
+        <w:tabs>
+          <w:tab w:val="num" w:pos="3545"/>
+        </w:tabs>
+        <w:ind w:start="3545" w:hanging="283"/>
+      </w:pPr>
+      <w:rPr>
+        <w:rFonts w:ascii="Symbol" w:hAnsi="Symbol" w:cs="Symbol" w:hint="default"/>
+      </w:rPr>
+    </w:lvl>
+    <w:lvl w:ilvl="5">
+      <w:start w:val="1"/>
+      <w:numFmt w:val="bullet"/>
+      <w:lvlText w:val=""/>
+      <w:lvlJc w:val="start"/>
+      <w:pPr>
+        <w:tabs>
+          <w:tab w:val="num" w:pos="4254"/>
+        </w:tabs>
+        <w:ind w:start="4254" w:hanging="283"/>
+      </w:pPr>
+      <w:rPr>
+        <w:rFonts w:ascii="Symbol" w:hAnsi="Symbol" w:cs="Symbol" w:hint="default"/>
+      </w:rPr>
+    </w:lvl>
+    <w:lvl w:ilvl="6">
+      <w:start w:val="1"/>
+      <w:numFmt w:val="bullet"/>
+      <w:lvlText w:val=""/>
+      <w:lvlJc w:val="start"/>
+      <w:pPr>
+        <w:tabs>
+          <w:tab w:val="num" w:pos="4963"/>
+        </w:tabs>
+        <w:ind w:start="4963" w:hanging="283"/>
+      </w:pPr>
+      <w:rPr>
+        <w:rFonts w:ascii="Symbol" w:hAnsi="Symbol" w:cs="Symbol" w:hint="default"/>
+      </w:rPr>
+    </w:lvl>
+    <w:lvl w:ilvl="7">
+      <w:start w:val="1"/>
+      <w:numFmt w:val="bullet"/>
+      <w:lvlText w:val=""/>
+      <w:lvlJc w:val="start"/>
+      <w:pPr>
+        <w:tabs>
+          <w:tab w:val="num" w:pos="5672"/>
+        </w:tabs>
+        <w:ind w:start="5672" w:hanging="283"/>
+      </w:pPr>
+      <w:rPr>
+        <w:rFonts w:ascii="Symbol" w:hAnsi="Symbol" w:cs="Symbol" w:hint="default"/>
+      </w:rPr>
+    </w:lvl>
+    <w:lvl w:ilvl="8">
+      <w:start w:val="1"/>
+      <w:numFmt w:val="bullet"/>
+      <w:lvlText w:val=""/>
+      <w:lvlJc w:val="start"/>
+      <w:pPr>
+        <w:tabs>
+          <w:tab w:val="num" w:pos="6381"/>
+        </w:tabs>
+        <w:ind w:start="6381" w:hanging="283"/>
+      </w:pPr>
+      <w:rPr>
+        <w:rFonts w:ascii="Symbol" w:hAnsi="Symbol" w:cs="Symbol" w:hint="default"/>
+      </w:rPr>
+    </w:lvl>
+  </w:abstractNum>
+  <w:abstractNum w:abstractNumId="7">
+    <w:lvl w:ilvl="0">
+      <w:start w:val="1"/>
+      <w:numFmt w:val="none"/>
+      <w:suff w:val="nothing"/>
+      <w:lvlText w:val=""/>
+      <w:lvlJc w:val="start"/>
+      <w:pPr>
+        <w:tabs>
+          <w:tab w:val="num" w:pos="0"/>
+        </w:tabs>
+        <w:ind w:start="0" w:hanging="0"/>
+      </w:pPr>
+    </w:lvl>
+    <w:lvl w:ilvl="1">
+      <w:start w:val="1"/>
+      <w:numFmt w:val="none"/>
+      <w:suff w:val="nothing"/>
+      <w:lvlText w:val=""/>
+      <w:lvlJc w:val="start"/>
+      <w:pPr>
+        <w:tabs>
+          <w:tab w:val="num" w:pos="0"/>
+        </w:tabs>
+        <w:ind w:start="0" w:hanging="0"/>
+      </w:pPr>
+    </w:lvl>
+    <w:lvl w:ilvl="2">
+      <w:start w:val="1"/>
+      <w:numFmt w:val="none"/>
+      <w:suff w:val="nothing"/>
+      <w:lvlText w:val=""/>
+      <w:lvlJc w:val="start"/>
+      <w:pPr>
+        <w:tabs>
+          <w:tab w:val="num" w:pos="0"/>
+        </w:tabs>
+        <w:ind w:start="0" w:hanging="0"/>
+      </w:pPr>
+    </w:lvl>
+    <w:lvl w:ilvl="3">
+      <w:start w:val="1"/>
+      <w:numFmt w:val="none"/>
+      <w:suff w:val="nothing"/>
+      <w:lvlText w:val=""/>
+      <w:lvlJc w:val="start"/>
+      <w:pPr>
+        <w:tabs>
+          <w:tab w:val="num" w:pos="0"/>
+        </w:tabs>
+        <w:ind w:start="0" w:hanging="0"/>
+      </w:pPr>
+    </w:lvl>
+    <w:lvl w:ilvl="4">
+      <w:start w:val="1"/>
+      <w:numFmt w:val="none"/>
+      <w:suff w:val="nothing"/>
+      <w:lvlText w:val=""/>
+      <w:lvlJc w:val="start"/>
+      <w:pPr>
+        <w:tabs>
+          <w:tab w:val="num" w:pos="0"/>
+        </w:tabs>
+        <w:ind w:start="0" w:hanging="0"/>
+      </w:pPr>
+    </w:lvl>
+    <w:lvl w:ilvl="5">
+      <w:start w:val="1"/>
+      <w:numFmt w:val="none"/>
+      <w:suff w:val="nothing"/>
+      <w:lvlText w:val=""/>
+      <w:lvlJc w:val="start"/>
+      <w:pPr>
+        <w:tabs>
+          <w:tab w:val="num" w:pos="0"/>
+        </w:tabs>
+        <w:ind w:start="0" w:hanging="0"/>
+      </w:pPr>
+    </w:lvl>
+    <w:lvl w:ilvl="6">
+      <w:start w:val="1"/>
+      <w:numFmt w:val="none"/>
+      <w:suff w:val="nothing"/>
+      <w:lvlText w:val=""/>
+      <w:lvlJc w:val="start"/>
+      <w:pPr>
+        <w:tabs>
+          <w:tab w:val="num" w:pos="0"/>
+        </w:tabs>
+        <w:ind w:start="0" w:hanging="0"/>
+      </w:pPr>
+    </w:lvl>
+    <w:lvl w:ilvl="7">
+      <w:start w:val="1"/>
+      <w:numFmt w:val="none"/>
+      <w:suff w:val="nothing"/>
+      <w:lvlText w:val=""/>
+      <w:lvlJc w:val="start"/>
+      <w:pPr>
+        <w:tabs>
+          <w:tab w:val="num" w:pos="0"/>
+        </w:tabs>
+        <w:ind w:start="0" w:hanging="0"/>
+      </w:pPr>
+    </w:lvl>
+    <w:lvl w:ilvl="8">
+      <w:start w:val="1"/>
+      <w:numFmt w:val="none"/>
+      <w:suff w:val="nothing"/>
+      <w:lvlText w:val=""/>
+      <w:lvlJc w:val="start"/>
+      <w:pPr>
+        <w:tabs>
+          <w:tab w:val="num" w:pos="0"/>
+        </w:tabs>
+        <w:ind w:start="0" w:hanging="0"/>
+      </w:pPr>
+    </w:lvl>
+  </w:abstractNum>
+  <w:num w:numId="1">
+    <w:abstractNumId w:val="1"/>
+  </w:num>
+  <w:num w:numId="2">
+    <w:abstractNumId w:val="2"/>
+  </w:num>
+  <w:num w:numId="3">
+    <w:abstractNumId w:val="3"/>
+  </w:num>
+  <w:num w:numId="4">
+    <w:abstractNumId w:val="4"/>
+  </w:num>
+  <w:num w:numId="5">
+    <w:abstractNumId w:val="5"/>
+  </w:num>
+  <w:num w:numId="6">
+    <w:abstractNumId w:val="6"/>
+  </w:num>
+  <w:num w:numId="7">
+    <w:abstractNumId w:val="7"/>
+  </w:num>
+</w:numbering>
 </file>
 
 <file path=word/styles.xml><?xml version="1.0" encoding="utf-8"?>

</xml_diff>